<commit_message>
Apply editorial decisions, add PDFs for all IRB attachments
Resolve the two open decisions in the standalone attachment set (the two
author-provided originals remain untouched):

- Corrections applied to the standalone files: "Paymen" -> "Payment"
  (Attachment A); flyer burden "30-45 min" -> "45 to 60 min" to match the
  proposal and information sheet (Attachment B); added the required IRB
  participant-rights contact line to Attachment A ("Questions"), with the IRB
  phone/email left as a marked placeholder.
- Design decisions confirmed as built: three lay rating scales (lay_r1-lay_r3,
  r4/r5 reserved) and the five-dimension expert rubric.

Replace the advisory memo with "Preparation Notes and Decisions" documenting the
corrections applied, the confirmed decisions, and the one remaining placeholder.

Add eye-catching PDF renders of all seven attachments and the notes document
under IRB/pdf/ alongside the Word files.
</commit_message>
<xml_diff>
--- a/IRB/Attachment_A_Participant_Information_Sheet.docx
+++ b/IRB/Attachment_A_Participant_Information_Sheet.docx
@@ -363,7 +363,7 @@
           <w:color w:val="1F4E79"/>
           <w:sz w:val="25"/>
         </w:rPr>
-        <w:t>Paymen</w:t>
+        <w:t>Payment</w:t>
       </w:r>
     </w:p>
     <w:p>
@@ -398,6 +398,14 @@
           <w:i w:val="0"/>
         </w:rPr>
         <w:t>If you have questions about the study, contact the principal investigator at naeem.muhammad@mayo.edu</w:t>
+      </w:r>
+    </w:p>
+    <w:p>
+      <w:r>
+        <w:rPr>
+          <w:i w:val="0"/>
+        </w:rPr>
+        <w:t>If you have questions about your rights as a research participant, or wish to speak with someone who is not part of the study team, contact the Mayo Clinic Institutional Review Board (IRB study number 26-008664) at [Mayo Clinic IRB telephone number and email to be inserted before submission].</w:t>
       </w:r>
     </w:p>
     <w:p>

</xml_diff>